<commit_message>
Add challenges and next-steps sections; replace figure placeholders
Adds two sections requested in review — Challenges Encountered and Next Steps
and Support Required — and renumbers Reflection and Conclusions accordingly.

Replaces both figure placeholders with real material: Figure 1 is a dataset
field capture rendered with its relabelled boxes, and Figure 5 is the app
reviewing a live capture with its share-of-shelf summary.

Corrects a circular claim in Figure 2 and Section 11. The four ratio bands
were presented as an observed distribution, but the thresholds define the
classes, so their separation is guaranteed by construction and is not evidence
for the approach. The supporting claim now rests on the independent
side-by-side can measurement, and the observed mislabelling of occluded
bottles is stated rather than omitted.
</commit_message>
<xml_diff>
--- a/docs/report/out/Aystro_Field_Training_Report_AR.docx
+++ b/docs/report/out/Aystro_Field_Training_Report_AR.docx
@@ -353,7 +353,7 @@
       <w:r>
         <w:drawing>
           <wp:inline xmlns:a="http://schemas.openxmlformats.org/drawingml/2006/main" xmlns:pic="http://schemas.openxmlformats.org/drawingml/2006/picture">
-            <wp:extent cx="5544000" cy="1601600"/>
+            <wp:extent cx="5544000" cy="4357584"/>
             <wp:docPr id="1" name="Picture 1"/>
             <wp:cNvGraphicFramePr>
               <a:graphicFrameLocks noChangeAspect="1"/>
@@ -362,7 +362,7 @@
               <a:graphicData uri="http://schemas.openxmlformats.org/drawingml/2006/picture">
                 <pic:pic>
                   <pic:nvPicPr>
-                    <pic:cNvPr id="0" name="fig1_placeholder.png"/>
+                    <pic:cNvPr id="0" name="fig1_annotated_shelf.jpg"/>
                     <pic:cNvPicPr/>
                   </pic:nvPicPr>
                   <pic:blipFill>
@@ -374,7 +374,7 @@
                   <pic:spPr>
                     <a:xfrm>
                       <a:off x="0" y="0"/>
-                      <a:ext cx="5544000" cy="1601600"/>
+                      <a:ext cx="5544000" cy="4357584"/>
                     </a:xfrm>
                     <a:prstGeom prst="rect"/>
                   </pic:spPr>
@@ -416,7 +416,7 @@
           <w:rtl/>
           <w:cs/>
         </w:rPr>
-        <w:t>صورة تمثيلية لرف من مجموعة البيانات مع صناديق الإحاطة المُعلَّمة مركّبة عليها، توضح كثافة الكائنات وصيغ التعبئة قيد الدراسة.</w:t>
+        <w:t>التقاط ميداني من مجموعة البيانات مع صناديق الإحاطة المُعاد تعليمها مركّبة عليه؛ ويدل اللون على صيغة التعبئة. وإلى جانب كثافة مشهد التدقيق، تُظهر الصورة قيدين يُفحصان لاحقاً: فمنتجات كثيرة لا تحمل أي تعليق (القسم الرابع)، وعدة صناديق أُسنِدت إليها صيغة يناقضها محتواها، إذ تدهورت هندستها بفعل انعكاس الزجاج والحجب (القسم السابع).</w:t>
       </w:r>
     </w:p>
     <w:p>
@@ -1206,7 +1206,7 @@
           <w:rtl/>
           <w:cs/>
         </w:rPr>
-        <w:t>التمييز الهندسي لصيغة التعبئة. يساراً: عبوتان متطابقتان في الملصق ومتساويتان في الحجم لكنهما مختلفتان في النسبة. يميناً: توزيع نسبة الأبعاد الملاحَظ عبر التعليقات الـ٤٬٦٤١ جميعها، مُظهِراً نطاقات متلاصقة غير متداخلة.</w:t>
+        <w:t>التمييز الهندسي لصيغة التعبئة. يساراً: عبوتان متطابقتان في الملصق ومتساويتان في الحجم لكنهما مختلفتان في النسبة — وهو الفصل المقيس الذي تقوم عليه القاعدة. يميناً: النطاقات النسبية المستخدمة لإسناد الصيغة عبر التعليقات الـ٤٬٦٤١ جميعها. وهذه النطاقات تعريفية لا مُكتشَفة: فالعتبات هي التي تُسنِد الصنف، ومن ثمّ فإن انفصالها خاصية للمخطط لا دليل عليه.</w:t>
       </w:r>
     </w:p>
     <w:p>
@@ -3143,7 +3143,7 @@
       <w:r>
         <w:drawing>
           <wp:inline xmlns:a="http://schemas.openxmlformats.org/drawingml/2006/main" xmlns:pic="http://schemas.openxmlformats.org/drawingml/2006/picture">
-            <wp:extent cx="5544000" cy="1601600"/>
+            <wp:extent cx="3891120" cy="5580000"/>
             <wp:docPr id="5" name="Picture 5"/>
             <wp:cNvGraphicFramePr>
               <a:graphicFrameLocks noChangeAspect="1"/>
@@ -3152,7 +3152,7 @@
               <a:graphicData uri="http://schemas.openxmlformats.org/drawingml/2006/picture">
                 <pic:pic>
                   <pic:nvPicPr>
-                    <pic:cNvPr id="0" name="fig4_placeholder.png"/>
+                    <pic:cNvPr id="0" name="fig4_app.jpg"/>
                     <pic:cNvPicPr/>
                   </pic:nvPicPr>
                   <pic:blipFill>
@@ -3164,7 +3164,7 @@
                   <pic:spPr>
                     <a:xfrm>
                       <a:off x="0" y="0"/>
-                      <a:ext cx="5544000" cy="1601600"/>
+                      <a:ext cx="3891120" cy="5580000"/>
                     </a:xfrm>
                     <a:prstGeom prst="rect"/>
                   </pic:spPr>
@@ -3206,7 +3206,7 @@
           <w:rtl/>
           <w:cs/>
         </w:rPr>
-        <w:t>لقطات شاشة من التطبيق: شاشتا اختيار السوق والالتقاط، ومحرِّر الكشف وهو يعرض تنبؤاً للنموذج قيد مراجعة المُشغِّل.</w:t>
+        <w:t>التطبيق وهو يراجع التقاطاً حياً: ٧٥ اكتشافاً أُعيدت لبرّاد واحد، مع ملخص حصة الرف محسوباً أسفلها. وتزاحمُ التسميات ذاته دالٌّ — فهو نظام التراص الكثيف الوارد في القسم السابع، والسبب في أن المحرِّر الموجَّه للمُشغِّل، لا الإثبات الآلي، هو التصميم الملائم.</w:t>
       </w:r>
     </w:p>
     <w:p>
@@ -3992,7 +3992,7 @@
           <w:rtl/>
           <w:cs/>
         </w:rPr>
-        <w:t>كما أثبت تحليل نسبة الأبعاد أن صيغ التعبئة الأربع تشغل نطاقات نسبية متلاصقة وغير متداخلة — unknown-package دون ١٫٠، وcan-std-330 بين ١٫٠ و٢٫١، وcan-slim بين ٢٫١ و٢٫٩، وbottle-pet فوق ٢٫٩ — بوسائط للأصناف تبلغ ٠٫٥٤ و١٫٧٣ و٢٫٥٧ و٣٫٢٦ على التوالي. وهذا الفصل هو الأساس التجريبي لاعتماد هندسة الصندوق إشارةً تمييزية صالحة للاستخدام.</w:t>
+        <w:t>وقد أسندت إعادةُ التعليم الصيغَ بحسب نطاقات نسبية — unknown-package دون ١٫٠، وcan-std-330 بين ١٫٠ و٢٫١، وcan-slim بين ٢٫١ و٢٫٩، وbottle-pet فوق ٢٫٩ — بوسائط للأصناف تبلغ ٠٫٥٤ و١٫٧٣ و٢٫٥٧ و٣٫٢٦. ويجب التصريح بوضوح بأن هذه النطاقات لا تُصادِق النهج بذاتها: فالعتبات هي التي تُعرِّف الأصناف، ومن ثمّ فإن انفصالها مضمون بحكم البناء. أما الدليل على أن هندسة الصندوق إشارة تمييزية صالحة فيأتي من القياس المستقل جنباً إلى جنب المُبلَّغ عنه في القسم السادس، حيث انفصلت صيغتا العلبة إلى عنقودين مقيسين متباينين بينما أسندهما المُصنِّف البصري إلى صنف واحد. كما أظهر فحص الصور المُعاد تعليمها أن القاعدة تُعلِّم الزجاجات المحجوبة جزئياً بوصفها علباً، وهو نمط الخطأ الذي يتنبأ به القسم السابع، وسبب إضافي لكون إسناد الصيغة يستوجب تحققاً قبل الاستخدام.</w:t>
       </w:r>
     </w:p>
     <w:p>
@@ -4035,7 +4035,198 @@
           <w:rtl/>
           <w:cs/>
         </w:rPr>
-        <w:t>١٢. تأمل في مُخرَجات التعلّم</w:t>
+        <w:t>١٢. الصعوبات المُواجَهة</w:t>
+      </w:r>
+    </w:p>
+    <w:p>
+      <w:pPr>
+        <w:keepNext w:val="0"/>
+        <w:bidi/>
+        <w:spacing w:after="160" w:before="0" w:line="348" w:lineRule="auto"/>
+        <w:jc w:val="both"/>
+      </w:pPr>
+      <w:r>
+        <w:rPr>
+          <w:rFonts w:ascii="Times New Roman" w:hAnsi="Times New Roman" w:cs="Noto Naskh Arabic"/>
+          <w:b w:val="0"/>
+          <w:i w:val="0"/>
+          <w:color w:val="111111"/>
+          <w:sz w:val="23"/>
+          <w:szCs w:val="23"/>
+          <w:rtl/>
+          <w:cs/>
+        </w:rPr>
+        <w:t>لم تكن الصعوبات الرئيسة في هذه الفترة خوارزمية بل استدلالية — أي تحديد ما تفعله البيانات والأدوات فعلياً، في مقابل ما كان يُفترض أنها تفعله.</w:t>
+      </w:r>
+    </w:p>
+    <w:p>
+      <w:pPr>
+        <w:keepNext w:val="0"/>
+        <w:bidi/>
+        <w:spacing w:after="160" w:before="0" w:line="348" w:lineRule="auto"/>
+        <w:jc w:val="both"/>
+      </w:pPr>
+      <w:r>
+        <w:rPr>
+          <w:rFonts w:ascii="Times New Roman" w:hAnsi="Times New Roman" w:cs="Noto Naskh Arabic"/>
+          <w:b w:val="0"/>
+          <w:i w:val="0"/>
+          <w:color w:val="111111"/>
+          <w:sz w:val="23"/>
+          <w:szCs w:val="23"/>
+          <w:rtl/>
+          <w:cs/>
+        </w:rPr>
+        <w:t>أولاها التباس التعليم على نطاق واسع. فقد استلزم ما يزيد على خُمسَي المدوَّنة وسماً بالالتباس، وتطلّب كل صندوق موسوم حُكماً لا تستطيع أي عتبة أن تصدره آلياً. كما كشفت إعادة تعليم ٤٬٦٤١ صندوقاً بحسب الصيغة الفيزيائية أن القاعدة الهندسية المحضة ترث كل عيب في الصندوق الذي تقرؤه: فالزجاجة المحجوبة جزئياً تُنتج صندوقاً قصيراً فتُقرأ خطأً على أنها علبة. وقد استهلك تمييزُ فروق الصيغة الحقيقية عن آثار ظروف التصوير حصةً معتبرة من الفترة، ولا تزال مجموعة التسميات الناتجة تحوي أخطاءً من هذا النوع.</w:t>
+      </w:r>
+    </w:p>
+    <w:p>
+      <w:pPr>
+        <w:keepNext w:val="0"/>
+        <w:bidi/>
+        <w:spacing w:after="160" w:before="0" w:line="348" w:lineRule="auto"/>
+        <w:jc w:val="both"/>
+      </w:pPr>
+      <w:r>
+        <w:rPr>
+          <w:rFonts w:ascii="Times New Roman" w:hAnsi="Times New Roman" w:cs="Noto Naskh Arabic"/>
+          <w:b w:val="0"/>
+          <w:i w:val="0"/>
+          <w:color w:val="111111"/>
+          <w:sz w:val="23"/>
+          <w:szCs w:val="23"/>
+          <w:rtl/>
+          <w:cs/>
+        </w:rPr>
+        <w:t>وثانيتها تشخيص سلوك كان الإعدادُ سببَه لا النمذجة. فقد بدا ضعفُ تغطية العلامات الأحدث في البداية إخفاقاً في الكشف، بينما كان في الواقع محكوماً بنسخة نموذج افتراضية دُرِّبت على ٢٧ صورة، تجاوزها الزمن منذ وقت طويل لكن سير العمل ظل يستدعيها. وبالمثل، بدا العجزُ عن الفصل بين صيغتَي العلبة نقصاً في بيانات التدريب، إلى أن تحدّدت الآلية — وهي أن نموذج التمثيل المتجهي يعيد تحجيم القصاصات إلى مربع ثابت فيُهدر نسبة الأبعاد قبل الاستدلال. وفي الحالتين كان العَرَض الظاهر يشير بعيداً عن السبب الفعلي.</w:t>
+      </w:r>
+    </w:p>
+    <w:p>
+      <w:pPr>
+        <w:keepNext w:val="0"/>
+        <w:bidi/>
+        <w:spacing w:after="160" w:before="0" w:line="348" w:lineRule="auto"/>
+        <w:jc w:val="both"/>
+      </w:pPr>
+      <w:r>
+        <w:rPr>
+          <w:rFonts w:ascii="Times New Roman" w:hAnsi="Times New Roman" w:cs="Noto Naskh Arabic"/>
+          <w:b w:val="0"/>
+          <w:i w:val="0"/>
+          <w:color w:val="111111"/>
+          <w:sz w:val="23"/>
+          <w:szCs w:val="23"/>
+          <w:rtl/>
+          <w:cs/>
+        </w:rPr>
+        <w:t>وثالثتها، وهي أكثر عملية، احتكاك الأدوات أثناء ترحيل مجموعة البيانات. فقد تبيّن أن الرفع الجماعي للتعليقات عبر واجهة برمجة التطبيقات لا يتيح مساراً للكتابة فوق تعليق صورة بعينها، فترك طلبٌ واحد مُشوَّه صورةً واحدة بتعليق فارغ يتعذّر تصحيحه برمجياً. وكان العملُ ضمن قيود منصة مُستضافة — بدلاً من افتراض سيطرة كاملة على مخزن البيانات — جزءاً من التعلّم بذاته.</w:t>
+      </w:r>
+    </w:p>
+    <w:p>
+      <w:pPr>
+        <w:keepNext/>
+        <w:bidi/>
+        <w:spacing w:before="360" w:after="140"/>
+        <w:jc w:val="right"/>
+      </w:pPr>
+      <w:r>
+        <w:rPr>
+          <w:rFonts w:ascii="Times New Roman" w:hAnsi="Times New Roman" w:cs="Noto Naskh Arabic"/>
+          <w:b/>
+          <w:bCs w:val="1"/>
+          <w:i w:val="0"/>
+          <w:color w:val="1A3A5C"/>
+          <w:sz w:val="28"/>
+          <w:szCs w:val="28"/>
+          <w:rtl/>
+          <w:cs/>
+        </w:rPr>
+        <w:t>١٣. الخطوات القادمة والدعم المطلوب</w:t>
+      </w:r>
+    </w:p>
+    <w:p>
+      <w:pPr>
+        <w:keepNext w:val="0"/>
+        <w:bidi/>
+        <w:spacing w:after="160" w:before="0" w:line="348" w:lineRule="auto"/>
+        <w:jc w:val="both"/>
+      </w:pPr>
+      <w:r>
+        <w:rPr>
+          <w:rFonts w:ascii="Times New Roman" w:hAnsi="Times New Roman" w:cs="Noto Naskh Arabic"/>
+          <w:b w:val="0"/>
+          <w:i w:val="0"/>
+          <w:color w:val="111111"/>
+          <w:sz w:val="23"/>
+          <w:szCs w:val="23"/>
+          <w:rtl/>
+          <w:cs/>
+        </w:rPr>
+        <w:t>تتمثل الأولوية التقنية العاجلة في تدريب الكاشف المحايد صنفياً على مجموعة التسميات المدمجة وقياسه قياساً سليماً. فحتى الآن يستند التحسّن المتوقَّع إلى حجة إحصائية — أي زيادة سداسية في عدد التعليقات لكل صنف كشف — لا إلى نتيجة مقيسة. ويلزم إجراء تقييم على مجموعة محجوزة يُبلَّغ فيه عن الاستدعاء لكل صنف ومتوسط الدقة، مقارنةً بالكاشف الحالي المُصنَّف بالعلامات التجارية، قبل أن يصح الادعاء بأن المعمارية تعمل لا أنها مُحكَمة التسويغ فحسب.</w:t>
+      </w:r>
+    </w:p>
+    <w:p>
+      <w:pPr>
+        <w:keepNext w:val="0"/>
+        <w:bidi/>
+        <w:spacing w:after="160" w:before="0" w:line="348" w:lineRule="auto"/>
+        <w:jc w:val="both"/>
+      </w:pPr>
+      <w:r>
+        <w:rPr>
+          <w:rFonts w:ascii="Times New Roman" w:hAnsi="Times New Roman" w:cs="Noto Naskh Arabic"/>
+          <w:b w:val="0"/>
+          <w:i w:val="0"/>
+          <w:color w:val="111111"/>
+          <w:sz w:val="23"/>
+          <w:szCs w:val="23"/>
+          <w:rtl/>
+          <w:cs/>
+        </w:rPr>
+        <w:t>وبعد ذلك تتوالى ثلاثة أعمال بالترتيب: استكمال تعليم المنتجات التي لم تُعلَّم أصلاً، وهو ما لا تغني عنه أي إعادة تنظيم لفضاء التسميات؛ وتجميع المعرض المرجعي الذي تعتمد عليه المرحلة الثانية؛ وتنفيذ دمج المرحلة الثالثة داخل سير العمل على المنصة، بحيث تعمل القاعدة المُتحقَّق منها على جانب العميل على جانب الخادم كذلك.</w:t>
+      </w:r>
+    </w:p>
+    <w:p>
+      <w:pPr>
+        <w:keepNext w:val="0"/>
+        <w:bidi/>
+        <w:spacing w:after="160" w:before="0" w:line="348" w:lineRule="auto"/>
+        <w:jc w:val="both"/>
+      </w:pPr>
+      <w:r>
+        <w:rPr>
+          <w:rFonts w:ascii="Times New Roman" w:hAnsi="Times New Roman" w:cs="Noto Naskh Arabic"/>
+          <w:b w:val="0"/>
+          <w:i w:val="0"/>
+          <w:color w:val="111111"/>
+          <w:sz w:val="23"/>
+          <w:szCs w:val="23"/>
+          <w:rtl/>
+          <w:cs/>
+        </w:rPr>
+        <w:t>ويتوقف التقدم في هذه الأعمال على مُدخلات لم تستطع فترة التدريب توفيرها من داخلها. وأبلغُها أثراً مجموعة مرجعية للمنتجات — أي صور نظيفة لمنتج مفرد لكل وحدة مخزون ضمن النطاق، مصحوبةً بكتالوج يبيّن الأبعاد الفيزيائية، إذ إن العتبات الهندسية مُعايَرة حالياً على صيغتَي علبة اثنتين وتحتاج توسيعاً مع كل صيغة جديدة تُصادَف. ويلزم كذلك توجيه بشأن مستوى الدقة الذي يُعدّ جاهزاً للإنتاج، لأن نقطة التشغيل الصحيحة لتدقيق الرفوف — ومن ثمّ مدى ميل النظام إلى إحالة القرار للتحقق البشري — حكمٌ تجاري لا تقني. وأخيراً، من شأن صور ميدانية إضافية تغطي أنواع متاجر وتكوينات رفوف وظروف إضاءة متباينة أن تُحسِّن التعميم تحسيناً جوهرياً؛ فالمدوَّنة الحالية البالغة ٢١٣ صورة صغيرة بالقياس إلى التباين الذي سيواجهه النظام المنشور.</w:t>
+      </w:r>
+    </w:p>
+    <w:p>
+      <w:pPr>
+        <w:keepNext/>
+        <w:bidi/>
+        <w:spacing w:before="360" w:after="140"/>
+        <w:jc w:val="right"/>
+      </w:pPr>
+      <w:r>
+        <w:rPr>
+          <w:rFonts w:ascii="Times New Roman" w:hAnsi="Times New Roman" w:cs="Noto Naskh Arabic"/>
+          <w:b/>
+          <w:bCs w:val="1"/>
+          <w:i w:val="0"/>
+          <w:color w:val="1A3A5C"/>
+          <w:sz w:val="28"/>
+          <w:szCs w:val="28"/>
+          <w:rtl/>
+          <w:cs/>
+        </w:rPr>
+        <w:t>١٤. تأمل في مُخرَجات التعلّم</w:t>
       </w:r>
     </w:p>
     <w:p>
@@ -4120,7 +4311,7 @@
           <w:rtl/>
           <w:cs/>
         </w:rPr>
-        <w:t>١٣. الاستنتاجات</w:t>
+        <w:t>١٥. الاستنتاجات</w:t>
       </w:r>
     </w:p>
     <w:p>

</xml_diff>

<commit_message>
Correct the recall-gap explanation: no unmigrated images, real cause is tiling
Investigated before running the "migrate ~800 images" task and found the
premise was wrong: aystro-project and aystro-project-v2 share the exact
same 227 raw images today (verified via images_search, matching counts
and matching first image id) -- there is nothing to migrate.

The real difference, found via versions_get on both trained versions:
aystro-project v20 (85.8% recall) was generated with 2x2 tiling and a
center static-crop; aystro-project-v2 v2 (81.1% recall) has neither.
Tiling is a known technique for detecting small, densely-packed objects,
which is exactly this domain. This is a testable, mechanistic explanation
for the recall gap, not yet verified by retraining -- logged as the first
next-step in the report rather than run now (declined by user pending
review).

Updated content_ar.py (Sections 6.1, 9, 10) and RESEARCH_NOTES.md to
reflect the corrected finding instead of the retracted claim.
</commit_message>
<xml_diff>
--- a/docs/report/out/Aystro_Field_Training_Report_AR.docx
+++ b/docs/report/out/Aystro_Field_Training_Report_AR.docx
@@ -1500,7 +1500,28 @@
           <w:rtl/>
           <w:cs/>
         </w:rPr>
-        <w:t>بلغ الكاشف الجديد متوسط دقة وإحكاماً أعلى على نحو ثلث صور التدريب — وهي نتيجة في كفاءة البيانات، لا مجرد حجة تصميمية. أما الاستدعاء فأدنى بأربع نقاط، ويجب ألا يُخفى ذلك. والتفسير معروف ولا يتعلق بالمعمارية: فالمشروع المحايد صنفياً يضم ٢٢٦ صورة خام فقط، بينما بلغ المشروع الأصلي ١٬١٩١ صورة مُعلَّمة — أي أن نحو ٨٠٠ صورة مُعلَّمة سلفاً لم تُرحَّل بعد. وترحيلها إعادة تسمية برمجية إلى صنف واحد، لا عمل تعليم جديد، وهو أرخص إجراء متاح لسدّ هذه الفجوة.</w:t>
+        <w:t>بلغ الكاشف الجديد متوسط دقة وإحكاماً أعلى على نحو ثلث صور التدريب — وهي نتيجة في كفاءة البيانات، لا مجرد حجة تصميمية. أما الاستدعاء فأدنى بأربع نقاط، ويجب ألا يُخفى ذلك.</w:t>
+      </w:r>
+    </w:p>
+    <w:p>
+      <w:pPr>
+        <w:keepNext w:val="0"/>
+        <w:bidi/>
+        <w:spacing w:after="160" w:before="0" w:line="348" w:lineRule="auto"/>
+        <w:jc w:val="both"/>
+      </w:pPr>
+      <w:r>
+        <w:rPr>
+          <w:rFonts w:ascii="Times New Roman" w:hAnsi="Times New Roman" w:cs="Noto Naskh Arabic"/>
+          <w:b w:val="0"/>
+          <w:i w:val="0"/>
+          <w:color w:val="111111"/>
+          <w:sz w:val="23"/>
+          <w:szCs w:val="23"/>
+          <w:rtl/>
+          <w:cs/>
+        </w:rPr>
+        <w:t>وتحقق فعلي من مصدر هذا الفارق — لا افتراض — كشف أنه ليس فجوة بيانات على الإطلاق: فعدد الصور الخام في المشروعين متطابق اليوم تماماً (٢٢٧ صورة في كلٍّ منهما، وحتى أول صورة بالمعرِّف ذاته)، خلافاً لما كان يُفترَض سابقاً من وجود صور مُعلَّمة لم تُرحَّل. والفارق الحقيقي في إعدادات المعالجة المسبقة عند توليد كل نسخة: فالكاشف الأصلي (النسخة ٢٠) قُسِّمت صوره إلى شبكة ٢×٢ (تقطيع/tiling) قبل التدريب، بينما لم يُطبَّق أي تقطيع على الكاشف الحالي. والتقطيع تقنية معروفة لتحسين كشف الكائنات الصغيرة والمتلاصقة تحديداً — وهي بالضبط طبيعة صور الرفوف هنا — لأنها تكبّر الحجم النسبي لكل منتج داخل الإطار الذي يراه النموذج. هذا تفسير قابل للاختبار المباشر (توليد نسخة جديدة بالتقطيع ذاته وإعادة التدريب)، ولم يُختبَر بعد عند كتابة هذا التقرير — مُدرَج كأول بند في القسم ١٠.</w:t>
       </w:r>
     </w:p>
     <w:p>
@@ -3572,7 +3593,7 @@
           <w:rtl/>
           <w:cs/>
         </w:rPr>
-        <w:t>٢. فجوة استدعاء الكاشف. نحو ٨٠٠ صورة مُعلَّمة سلفاً لم تُرحَّل إلى المشروع المحايد صنفياً، وهي التفسير المرجَّح لفارق النقاط الأربع في الاستدعاء. مهمة هندسة بيانات لا بحث جديد.</w:t>
+        <w:t>٢. فجوة استدعاء الكاشف غير مفسَّرة بعد بشكل قاطع. الفرضية الحالية — فارق إعداد التقطيع (tiling) بين النسختين، لا فارق في عدد الصور — مبنيّة على فحص إعدادات التوليد الفعلية، لكنها لم تُختبَر بإعادة تدريب فعلية بعد. اختبارها يستوجب تدريباً واحداً (نحو ٤٥ دقيقة)، لا بحثاً جديداً.</w:t>
       </w:r>
     </w:p>
     <w:p>
@@ -3720,7 +3741,7 @@
           <w:rtl/>
           <w:cs/>
         </w:rPr>
-        <w:t>أولاً، ما لا يحتاج شيئاً من خارج الفريق: ترحيل الصور الثمانمئة غير المُرحَّلة وإعادة تدريب الكاشف على المجموعة الأوفر، وهو أرخص إجراء متاح لسدّ فجوة الاستدعاء؛ ثم تدقيق ما تبقّى من العلامات (‏Cappy تحديداً، إذ تأكّد وجود تنوّع حقيقي في نكهاتها) لتحديد أيها يستحق مُصنِّف متغيّرات خاصاً به؛ ثم قياس كلفة الاستدلال الفعلية من الاستخدام الحي. وكل بند من هذه يقع في نطاق أيام لا أسابيع، استناداً إلى الزمن الذي استغرقه فعلياً بناء مُصنِّفَي Fanta وXL Energy.</w:t>
+        <w:t>أولاً، ما لا يحتاج شيئاً من خارج الفريق: توليد نسخة جديدة من الكاشف المحايد صنفياً بإعداد تقطيع ٢×٢ مطابق للكاشف الأصلي، وتدريبها، لاختبار فرضية القسم ٦٫١ مباشرةً — تدريب واحد يحسم السؤال بدلاً من افتراضه؛ ثم تدقيق ما تبقّى من العلامات (‏Cappy تحديداً، إذ تأكّد وجود تنوّع حقيقي في نكهاتها) لتحديد أيها يستحق مُصنِّف متغيّرات خاصاً به؛ ثم قياس كلفة الاستدلال الفعلية من الاستخدام الحي. وكل بند من هذه يقع في نطاق ساعات إلى أيام لا أسابيع، استناداً إلى الزمن الذي استغرقه فعلياً بناء مُصنِّفَي Fanta وXL Energy.</w:t>
       </w:r>
     </w:p>
     <w:p>

</xml_diff>

<commit_message>
Correct the per-product inference cost concern: billed per photo, not per model call
Asked Roboflow's own agent directly: serverless Workflow inference is
billed per workflow execution (one API call per image), not per internal
model/block step. A photo triggering 1 detector + 3 classifiers is ~1
billed inference, and the app already sends exactly one request per
capture. This means shelf density affects wall-clock latency (already
measured: 14.20s for 60 products) but not credit cost the way earlier
report drafts speculated.

Not fully closed -- the agent recommended confirming from the workspace's
real usage dashboard, which isn't reachable via any tool here. Wording
updated to "very likely resolved, one dashboard check away" rather than
"unmeasured, could scale badly" in Sections 6.3, 9, and 10.
</commit_message>
<xml_diff>
--- a/docs/report/out/Aystro_Field_Training_Report_AR.docx
+++ b/docs/report/out/Aystro_Field_Training_Report_AR.docx
@@ -2488,7 +2488,7 @@
           <w:rtl/>
           <w:cs/>
         </w:rPr>
-        <w:t>وثمة كلفة مقابلة لم تُقَس بعد وتُذكر هنا بدلاً من إغفالها: فخط المعالجة يُصدر الآن استدعاءات تصنيف لكل منتج مكتشَف لا لكل صورة، فرفّ مزدحم بعشرين منتجاً يستهلك أكثر بكثير من صورة تحوي منتجين. وهذا أثر تشغيلي حقيقي ينبغي قياسه من الاستخدام الحي قبل الاستشهاد به كرقم.</w:t>
+        <w:t>وتحقُّقٌ مباشر من نموذج التسعير — لا افتراض — نفى مخاوف كانت مطروحة سابقاً حول هذه النقطة تحديداً. فقد كان يُفترَض أن رفّاً مزدحماً بعشرين منتجاً، مقارنةً بصورة تحوي منتجَين، يستهلك كلفة أكبر بكثير لأن خط المعالجة يُصدر استدعاء علامة واستدعاء مادة تعبئة لكل منتج مكتشَف لا لكل صورة. لكن الاستدلال على سير عمل (Workflow) في Roboflow يُحاسَب كوحدة استدعاء واحدة لكل صورة تُرسَل إليه، بصرف النظر عن عدد خطوات النماذج الداخلية التي يُشغِّلها — فتطبيق فلاتر يرسل صورة واحدة لكل التقاطة، لا استدعاءً منفصلاً لكل منتج. أي أن الأثر الحقيقي لكثافة الرف ليس في الكلفة المالية بل في زمن الاستجابة، وهو بالضبط ما قِيس في القسم ٦٫٢ (١٤٫٢٠ ثانية لصورة تضم ٦٠ منتجاً بعد التوجيه). وهذا الفهم مصدره سؤال مباشر لمساعد Roboflow الرسمي لا وثيقة تسعير مقروءة حرفياً، فيبقى التحقق النهائي من لوحة الاستخدام الفعلي في لوحة تحكم مساحة العمل (‏app.roboflow.com) الخطوة الحاسمة الأخيرة.</w:t>
       </w:r>
     </w:p>
     <w:p>
@@ -3677,7 +3677,7 @@
           <w:rtl/>
           <w:cs/>
         </w:rPr>
-        <w:t>٦. كلفة الاستدلال لكل منتج غير مقيسة. الأثر التشغيلي الوارد في القسم ٦٫٣ ينبغي أن يأتي من الاستخدام الحي قبل استخدامه في أي إسقاط مالي.</w:t>
+        <w:t>٦. كلفة الاستدلال — مُوضَّحة جزئياً، لا مقفلة بعد. تبيّن أن الاستدلال يُحاسَب لكل صورة لا لكل منتج داخلها (القسم ٦٫٣)، فكثافة الرف تكلّف زمناً لا مالاً إضافياً. يبقى تأكيد هذا نهائياً من لوحة الاستخدام الفعلي في مساحة العمل، وهي خطوة تحقق لا بحث جديد.</w:t>
       </w:r>
     </w:p>
     <w:p>
@@ -3741,7 +3741,7 @@
           <w:rtl/>
           <w:cs/>
         </w:rPr>
-        <w:t>أولاً، ما لا يحتاج شيئاً من خارج الفريق: توليد نسخة جديدة من الكاشف المحايد صنفياً بإعداد تقطيع ٢×٢ مطابق للكاشف الأصلي، وتدريبها، لاختبار فرضية القسم ٦٫١ مباشرةً — تدريب واحد يحسم السؤال بدلاً من افتراضه؛ ثم تدقيق ما تبقّى من العلامات (‏Cappy تحديداً، إذ تأكّد وجود تنوّع حقيقي في نكهاتها) لتحديد أيها يستحق مُصنِّف متغيّرات خاصاً به؛ ثم قياس كلفة الاستدلال الفعلية من الاستخدام الحي. وكل بند من هذه يقع في نطاق ساعات إلى أيام لا أسابيع، استناداً إلى الزمن الذي استغرقه فعلياً بناء مُصنِّفَي Fanta وXL Energy.</w:t>
+        <w:t>أولاً، ما لا يحتاج شيئاً من خارج الفريق: توليد نسخة جديدة من الكاشف المحايد صنفياً بإعداد تقطيع ٢×٢ مطابق للكاشف الأصلي، وتدريبها، لاختبار فرضية القسم ٦٫١ مباشرةً — تدريب واحد يحسم السؤال بدلاً من افتراضه؛ ثم تدقيق ما تبقّى من العلامات (‏Cappy تحديداً، إذ تأكّد وجود تنوّع حقيقي في نكهاتها) لتحديد أيها يستحق مُصنِّف متغيّرات خاصاً به؛ ثم تأكيد نموذج التسعير الوارد في القسم ٦٫٣ من لوحة الاستخدام الفعلي — تحقق سريع لا قياس من الصفر. وكل بند من هذه يقع في نطاق ساعات إلى أيام لا أسابيع، استناداً إلى الزمن الذي استغرقه فعلياً بناء مُصنِّفَي Fanta وXL Energy.</w:t>
       </w:r>
     </w:p>
     <w:p>

</xml_diff>